<commit_message>
Corregir formato de reposos
</commit_message>
<xml_diff>
--- a/public/FORMATO DE PERMISOS - REPOSOS.docx
+++ b/public/FORMATO DE PERMISOS - REPOSOS.docx
@@ -382,13 +382,9 @@
             <w:gridSpan w:val="3"/>
           </w:tcPr>
           <w:p>
-            <w:pPr>
-              <w:pStyle w:val="TableParagraph"/>
-              <w:rPr>
-                <w:rFonts w:ascii="Times New Roman"/>
-                <w:sz w:val="16"/>
-              </w:rPr>
-            </w:pPr>
+            <w:r>
+              <w:t>{d_gen}</w:t>
+            </w:r>
           </w:p>
         </w:tc>
         <w:tc>
@@ -396,13 +392,9 @@
             <w:tcW w:w="1002" w:type="dxa"/>
           </w:tcPr>
           <w:p>
-            <w:pPr>
-              <w:pStyle w:val="TableParagraph"/>
-              <w:rPr>
-                <w:rFonts w:ascii="Times New Roman"/>
-                <w:sz w:val="16"/>
-              </w:rPr>
-            </w:pPr>
+            <w:r>
+              <w:t>{m_gen}</w:t>
+            </w:r>
           </w:p>
         </w:tc>
         <w:tc>
@@ -410,13 +402,9 @@
             <w:tcW w:w="1122" w:type="dxa"/>
           </w:tcPr>
           <w:p>
-            <w:pPr>
-              <w:pStyle w:val="TableParagraph"/>
-              <w:rPr>
-                <w:rFonts w:ascii="Times New Roman"/>
-                <w:sz w:val="16"/>
-              </w:rPr>
-            </w:pPr>
+            <w:r>
+              <w:t>{a_gen}</w:t>
+            </w:r>
           </w:p>
         </w:tc>
       </w:tr>
@@ -778,13 +766,9 @@
             </w:tcBorders>
           </w:tcPr>
           <w:p>
-            <w:pPr>
-              <w:pStyle w:val="TableParagraph"/>
-              <w:rPr>
-                <w:rFonts w:ascii="Times New Roman"/>
-                <w:sz w:val="16"/>
-              </w:rPr>
-            </w:pPr>
+            <w:r>
+              <w:t>{cedula}</w:t>
+            </w:r>
           </w:p>
         </w:tc>
         <w:tc>
@@ -809,13 +793,9 @@
             </w:tcBorders>
           </w:tcPr>
           <w:p>
-            <w:pPr>
-              <w:pStyle w:val="TableParagraph"/>
-              <w:rPr>
-                <w:rFonts w:ascii="Times New Roman"/>
-                <w:sz w:val="16"/>
-              </w:rPr>
-            </w:pPr>
+            <w:r>
+              <w:t>{codigo}</w:t>
+            </w:r>
           </w:p>
         </w:tc>
       </w:tr>
@@ -834,13 +814,7 @@
             </w:tcBorders>
           </w:tcPr>
           <w:p>
-            <w:pPr>
-              <w:pStyle w:val="TableParagraph"/>
-              <w:rPr>
-                <w:rFonts w:ascii="Times New Roman"/>
-                <w:sz w:val="16"/>
-              </w:rPr>
-            </w:pPr>
+            <w:r/>
           </w:p>
         </w:tc>
         <w:tc>
@@ -1977,9 +1951,7 @@
             </w:tcBorders>
           </w:tcPr>
           <w:p>
-            <w:r>
-              <w:t>{cargo}</w:t>
-            </w:r>
+            <w:r/>
           </w:p>
         </w:tc>
         <w:tc>
@@ -1993,9 +1965,7 @@
             </w:tcBorders>
           </w:tcPr>
           <w:p>
-            <w:r>
-              <w:t>{cargo}</w:t>
-            </w:r>
+            <w:r/>
           </w:p>
         </w:tc>
         <w:tc>
@@ -2009,9 +1979,7 @@
             </w:tcBorders>
           </w:tcPr>
           <w:p>
-            <w:r>
-              <w:t>{cargo}</w:t>
-            </w:r>
+            <w:r/>
           </w:p>
         </w:tc>
         <w:tc>
@@ -2026,9 +1994,7 @@
             </w:tcBorders>
           </w:tcPr>
           <w:p>
-            <w:r>
-              <w:t>{cargo}</w:t>
-            </w:r>
+            <w:r/>
           </w:p>
         </w:tc>
         <w:tc>
@@ -2153,7 +2119,9 @@
             <w:r>
               <w:t>6. OBSERVACION</w:t>
               <w:br/>
-              <w:t>SE ANEXA CONSTANCIA MÉDICA DE REPOSO POR {anexo} {anexo} {anexo} {anexo} {anexo} {anexo} {anexo} {anexo} {anexo} {anexo} {anexo} {anexo} {anexo}</w:t>
+              <w:t>SE ANEXA CONSTANCIA MÉDICA DE REPOSO POR {anexo}</w:t>
+              <w:br/>
+              <w:t>Observación: {observacion}</w:t>
             </w:r>
           </w:p>
         </w:tc>
@@ -2679,9 +2647,7 @@
             <w:tcW w:w="631" w:type="dxa"/>
           </w:tcPr>
           <w:p>
-            <w:r>
-              <w:t>{fecha_inicio}</w:t>
-            </w:r>
+            <w:r/>
           </w:p>
         </w:tc>
         <w:tc>
@@ -2689,9 +2655,7 @@
             <w:tcW w:w="655" w:type="dxa"/>
           </w:tcPr>
           <w:p>
-            <w:r>
-              <w:t>{fecha_inicio}</w:t>
-            </w:r>
+            <w:r/>
           </w:p>
         </w:tc>
         <w:tc>
@@ -2699,9 +2663,7 @@
             <w:tcW w:w="585" w:type="dxa"/>
           </w:tcPr>
           <w:p>
-            <w:r>
-              <w:t>{fecha_inicio}</w:t>
-            </w:r>
+            <w:r/>
           </w:p>
         </w:tc>
         <w:tc>
@@ -2709,9 +2671,7 @@
             <w:tcW w:w="695" w:type="dxa"/>
           </w:tcPr>
           <w:p>
-            <w:r>
-              <w:t>{fecha_culminacion}</w:t>
-            </w:r>
+            <w:r/>
           </w:p>
         </w:tc>
         <w:tc>
@@ -2719,9 +2679,7 @@
             <w:tcW w:w="651" w:type="dxa"/>
           </w:tcPr>
           <w:p>
-            <w:r>
-              <w:t>{fecha_culminacion}</w:t>
-            </w:r>
+            <w:r/>
           </w:p>
         </w:tc>
         <w:tc>
@@ -2729,9 +2687,7 @@
             <w:tcW w:w="585" w:type="dxa"/>
           </w:tcPr>
           <w:p>
-            <w:r>
-              <w:t>{fecha_culminacion}</w:t>
-            </w:r>
+            <w:r/>
           </w:p>
         </w:tc>
         <w:tc>
@@ -2761,9 +2717,7 @@
             <w:tcW w:w="710" w:type="dxa"/>
           </w:tcPr>
           <w:p>
-            <w:r>
-              <w:t>{fecha_inicio}</w:t>
-            </w:r>
+            <w:r/>
           </w:p>
         </w:tc>
         <w:tc>
@@ -2771,9 +2725,7 @@
             <w:tcW w:w="966" w:type="dxa"/>
           </w:tcPr>
           <w:p>
-            <w:r>
-              <w:t>{fecha_culminacion}</w:t>
-            </w:r>
+            <w:r/>
           </w:p>
         </w:tc>
         <w:tc>
@@ -2781,13 +2733,9 @@
             <w:tcW w:w="631" w:type="dxa"/>
           </w:tcPr>
           <w:p>
-            <w:pPr>
-              <w:pStyle w:val="TableParagraph"/>
-              <w:rPr>
-                <w:rFonts w:ascii="Times New Roman"/>
-                <w:sz w:val="16"/>
-              </w:rPr>
-            </w:pPr>
+            <w:r>
+              <w:t>{d_desde}</w:t>
+            </w:r>
           </w:p>
         </w:tc>
         <w:tc>
@@ -2795,13 +2743,9 @@
             <w:tcW w:w="655" w:type="dxa"/>
           </w:tcPr>
           <w:p>
-            <w:pPr>
-              <w:pStyle w:val="TableParagraph"/>
-              <w:rPr>
-                <w:rFonts w:ascii="Times New Roman"/>
-                <w:sz w:val="16"/>
-              </w:rPr>
-            </w:pPr>
+            <w:r>
+              <w:t>{m_desde}</w:t>
+            </w:r>
           </w:p>
         </w:tc>
         <w:tc>
@@ -2809,13 +2753,9 @@
             <w:tcW w:w="585" w:type="dxa"/>
           </w:tcPr>
           <w:p>
-            <w:pPr>
-              <w:pStyle w:val="TableParagraph"/>
-              <w:rPr>
-                <w:rFonts w:ascii="Times New Roman"/>
-                <w:sz w:val="16"/>
-              </w:rPr>
-            </w:pPr>
+            <w:r>
+              <w:t>{a_desde}</w:t>
+            </w:r>
           </w:p>
         </w:tc>
         <w:tc>
@@ -2823,13 +2763,9 @@
             <w:tcW w:w="695" w:type="dxa"/>
           </w:tcPr>
           <w:p>
-            <w:pPr>
-              <w:pStyle w:val="TableParagraph"/>
-              <w:rPr>
-                <w:rFonts w:ascii="Times New Roman"/>
-                <w:sz w:val="16"/>
-              </w:rPr>
-            </w:pPr>
+            <w:r>
+              <w:t>{d_hasta}</w:t>
+            </w:r>
           </w:p>
         </w:tc>
         <w:tc>
@@ -2837,13 +2773,9 @@
             <w:tcW w:w="651" w:type="dxa"/>
           </w:tcPr>
           <w:p>
-            <w:pPr>
-              <w:pStyle w:val="TableParagraph"/>
-              <w:rPr>
-                <w:rFonts w:ascii="Times New Roman"/>
-                <w:sz w:val="16"/>
-              </w:rPr>
-            </w:pPr>
+            <w:r>
+              <w:t>{m_hasta}</w:t>
+            </w:r>
           </w:p>
         </w:tc>
         <w:tc>
@@ -2851,13 +2783,9 @@
             <w:tcW w:w="585" w:type="dxa"/>
           </w:tcPr>
           <w:p>
-            <w:pPr>
-              <w:pStyle w:val="TableParagraph"/>
-              <w:rPr>
-                <w:rFonts w:ascii="Times New Roman"/>
-                <w:sz w:val="16"/>
-              </w:rPr>
-            </w:pPr>
+            <w:r>
+              <w:t>{a_hasta}</w:t>
+            </w:r>
           </w:p>
         </w:tc>
         <w:tc>

</xml_diff>

<commit_message>
Remover horas de la planilla de reposos
</commit_message>
<xml_diff>
--- a/public/FORMATO DE PERMISOS - REPOSOS.docx
+++ b/public/FORMATO DE PERMISOS - REPOSOS.docx
@@ -2405,9 +2405,7 @@
             <w:shd w:val="clear" w:color="auto" w:fill="F3F3F3"/>
           </w:tcPr>
           <w:p>
-            <w:r>
-              <w:t>{horas}</w:t>
-            </w:r>
+            <w:r/>
           </w:p>
         </w:tc>
         <w:tc>

</xml_diff>